<commit_message>
Clean final report and citations
</commit_message>
<xml_diff>
--- a/reports/高级机器学习理论课程报告_李小茹_终版.docx
+++ b/reports/高级机器学习理论课程报告_李小茹_终版.docx
@@ -407,7 +407,7 @@
           <w:rFonts w:ascii="Times New Roman" w:hAnsi="Times New Roman" w:eastAsia="SimSun"/>
           <w:sz w:val="22"/>
         </w:rPr>
-        <w:t>摘要：房价预测是结构化表格数据建模中的典型回归任务。本文以 Kaggle House Prices - Advanced Regression Techniques 竞赛为研究对象，围绕包含数值变量、类别变量、缺失值和非线性特征交互的住宅成交价预测问题，构建了从基线模型到扩展集成算法的完整机器学习实验流程。研究首先对房价分布、缺失特征、关键数值变量相关性以及代表性房屋属性进行探索性分析；随后以 Ridge Regression 和 Random Forest 作为基线，进一步引入 XGBoost、LightGBM、CatBoost 三类具有代表性的梯度提升树算法，并实现基于验证误差倒数的加权融合方法。实验采用 5 折交叉验证，在 log1p(SalePrice) 目标空间中计算 RMSE，作为 Kaggle RMSLE 指标的本地等价形式。结果表明，梯度提升树模型显著优于线性基线和随机森林，其中 CatBoost 取得最优本地 RMSLE 0.12029，XGBoost 以 0.12039 紧随其后；将 CatBoost 最优模型提交至 Kaggle 后，Public Score 为 0.12481，与本地验证结果较为一致。本文进一步从模型机制、数据特征、融合失败原因、泛化误差和后续改进方向等方面进行分析，说明梯度提升树仍是中小规模结构化竞赛任务中的强基线与有效扩展算法。</w:t>
+        <w:t>摘要：房价预测是结构化表格数据建模中的典型回归任务。本文以 Kaggle House Prices - Advanced Regression Techniques 竞赛为研究对象，围绕包含数值变量、类别变量、缺失值和非线性特征交互的住宅成交价预测问题，构建了从基线模型到扩展集成算法的完整机器学习实验流程。近年来的表格数据研究表明，尽管深度学习在多类非结构化数据上表现突出，梯度提升树和其他树集成模型在中小规模表格数据上仍然具有很强竞争力[2-5]。基于这一背景，本文首先对房价分布、缺失特征、关键数值变量相关性以及代表性房屋属性进行探索性分析；随后以 Ridge Regression 和 Random Forest 作为基线，进一步引入 XGBoost、LightGBM、CatBoost 三类具有代表性的梯度提升树算法，并实现基于验证误差倒数的加权融合方法。实验采用 5 折交叉验证，在 log1p(SalePrice) 目标空间中计算 RMSE，作为 Kaggle RMSLE 指标的本地等价形式。结果表明，梯度提升树模型显著优于线性基线和随机森林，其中 CatBoost 取得最优本地 RMSLE 0.12029，XGBoost 以 0.12039 紧随其后；将 CatBoost 最优模型提交至 Kaggle 后，Public Score 为 0.12481，与本地验证结果较为一致。本文进一步从模型机制、数据特征、融合失败原因、泛化误差和后续改进方向等方面进行分析，说明梯度提升树仍是中小规模结构化竞赛任务中的强基线与有效扩展算法。</w:t>
       </w:r>
     </w:p>
     <w:p>
@@ -478,7 +478,7 @@
           <w:rFonts w:ascii="Times New Roman" w:hAnsi="Times New Roman" w:eastAsia="SimSun"/>
           <w:sz w:val="22"/>
         </w:rPr>
-        <w:t>Kaggle House Prices 竞赛提供了一个较为规范的公开基准。训练集包含 1460 条住宅样本，测试集包含 1459 条样本，特征数量接近 80 个，目标变量为 SalePrice。竞赛评价指标 RMSLE 关注预测值与真实值的相对比例误差，对高价房和低价房具有更均衡的惩罚效果。与单纯追求线上分数不同，本文更加关注模型选择、算法机制、实验设计和结果解释，目标是形成一份可复现、可分析、可扩展的课程实验报告。</w:t>
+        <w:t>Kaggle House Prices 竞赛提供了一个较为规范的公开基准[1]。训练集包含 1460 条住宅样本，测试集包含 1459 条样本，特征数量接近 80 个，目标变量为 SalePrice。竞赛评价指标 RMSLE 关注预测值与真实值的相对比例误差，对高价房和低价房具有更均衡的惩罚效果。与单纯追求线上分数不同，本文更加关注模型选择、算法机制、实验设计和结果解释，目标是形成一份可复现、可分析、可扩展的课程实验报告。</w:t>
       </w:r>
     </w:p>
     <w:p>
@@ -518,7 +518,7 @@
           <w:rFonts w:ascii="Times New Roman" w:hAnsi="Times New Roman" w:eastAsia="SimSun"/>
           <w:sz w:val="22"/>
         </w:rPr>
-        <w:t>梯度提升树是结构化数据建模中最成功的算法族之一。Friedman 提出的 Gradient Boosting Machine 将弱学习器按加法模型逐步组合，通过拟合损失函数的负梯度来降低经验风险。Chen 和 Guestrin 提出的 XGBoost 在目标函数中显式引入正则化项，并使用二阶泰勒展开近似损失，使分裂增益计算更精确，成为大量 Kaggle 竞赛中的强力基线。</w:t>
+        <w:t>梯度提升树是结构化数据建模中最成功的算法族之一。在近五年的表格数据研究中，多项基准研究仍将 XGBoost、LightGBM、CatBoost 等梯度提升树算法作为强基线，并将其作为评价深度表格模型是否真正有效的重要参照[2-6]。这说明，在样本规模有限、变量类型混合、特征语义较强的任务中，树模型的归纳偏置仍然具有现实价值。</w:t>
       </w:r>
     </w:p>
     <w:p>
@@ -531,7 +531,7 @@
           <w:rFonts w:ascii="Times New Roman" w:hAnsi="Times New Roman" w:eastAsia="SimSun"/>
           <w:sz w:val="22"/>
         </w:rPr>
-        <w:t>LightGBM 针对大规模特征和样本训练效率进行了优化，采用基于直方图的分裂查找、叶子优先生长策略、互斥特征捆绑和基于梯度的单边采样，在保持模型精度的同时提高训练速度。CatBoost 则重点解决类别特征处理和预测偏移问题，通过有序目标统计和有序提升机制降低目标泄露风险，对类别变量较多的表格数据具有良好适应性。</w:t>
+        <w:t>近年来，深度学习在视觉、语音和自然语言处理领域取得巨大成功，但在中小规模表格数据上，树模型仍然经常优于深度神经网络。Grinsztajn 等在 NeurIPS 2022 的大规模基准研究中指出，树模型在典型表格数据上仍保持很强竞争力[2]；Gorishniy 等提出的 FT-Transformer 等模型推动了表格深度学习发展，但也表明深度模型需要精心设计和调参[3]。Borisov 等的综述和 Shwartz-Ziv 等的实证研究进一步说明，表格数据的异质变量、稀疏类别和不规则决策边界使得梯度提升树依然难以被简单替代[4-5]。</w:t>
       </w:r>
     </w:p>
     <w:p>
@@ -544,7 +544,7 @@
           <w:rFonts w:ascii="Times New Roman" w:hAnsi="Times New Roman" w:eastAsia="SimSun"/>
           <w:sz w:val="22"/>
         </w:rPr>
-        <w:t>近年来，深度学习在视觉、语音和自然语言处理领域取得巨大成功，但在中小规模表格数据上，树模型仍然经常优于深度神经网络。Grinsztajn 等研究指出，在不进行大规模预训练的条件下，基于树的模型在许多真实表格任务上仍具优势。Borisov 等综述也表明，表格数据中的异质变量、稀疏类别和非平滑决策边界使得梯度提升树依然具有很强竞争力。因此，本文选择梯度提升树作为扩展算法，符合当前结构化数据建模的主流实践。</w:t>
+        <w:t>另一方面，TabPFN 和 TabZilla 等新近工作表明，表格数据学习正在向预训练、上下文学习和更系统的基准评测方向发展[6-7]。Somvanshi 等 2024 年综述总结了深度表格学习的最新进展，也指出可解释性、泛化能力和计算效率仍是重要挑战[8]。因此，本文选择梯度提升树作为扩展算法，并将其与基础模型和简单融合方法对比，既符合 Kaggle 竞赛实践，也符合近年表格数据研究的经验结论。</w:t>
       </w:r>
     </w:p>
     <w:p>
@@ -1213,7 +1213,7 @@
           <w:rFonts w:ascii="Times New Roman" w:hAnsi="Times New Roman" w:eastAsia="SimSun"/>
           <w:sz w:val="22"/>
         </w:rPr>
-        <w:t>House Prices 数据集来自 Ames 房价数据的竞赛化版本，变量覆盖住宅建筑、位置、质量、空间、地下室、车库和交易时间等方面。训练集有 1460 条样本，测试集有 1459 条样本。该数据规模不大，但变量类型丰富，适合比较不同机器学习算法在结构化数据上的表现。</w:t>
+        <w:t>House Prices 数据集来自 Kaggle 公开竞赛[1]，变量覆盖住宅建筑、位置、质量、空间、地下室、车库和交易时间等方面。训练集有 1460 条样本，测试集有 1459 条样本。该数据规模不大，但变量类型丰富，适合比较不同机器学习算法在结构化数据上的表现。</w:t>
       </w:r>
     </w:p>
     <w:p>
@@ -1758,7 +1758,7 @@
           <w:rFonts w:ascii="Times New Roman" w:hAnsi="Times New Roman" w:eastAsia="SimSun"/>
           <w:sz w:val="22"/>
         </w:rPr>
-        <w:t>XGBoost 将模型表示为若干回归树的加法组合。每一轮新增一棵树，用于拟合当前模型的残差方向。其核心特点包括二阶梯度近似、正则化复杂度惩罚、列采样、行采样和缺失值默认方向学习。这些机制使 XGBoost 在保证精度的同时具有较强的泛化能力。</w:t>
+        <w:t>XGBoost 将模型表示为若干回归树的加法组合。每一轮新增一棵树，用于拟合当前模型的残差方向。其核心特点包括二阶梯度近似、正则化复杂度惩罚、列采样、行采样和缺失值默认方向学习。近年表格数据基准研究通常仍将 XGBoost 作为核心对照模型[2,5,7]，这也说明其在结构化任务中的基础地位。</w:t>
       </w:r>
     </w:p>
     <w:p>
@@ -1812,7 +1812,7 @@
           <w:rFonts w:ascii="Times New Roman" w:hAnsi="Times New Roman" w:eastAsia="SimSun"/>
           <w:sz w:val="22"/>
         </w:rPr>
-        <w:t>CatBoost 的优势在于类别特征处理和有序提升。传统目标编码容易引入目标泄露，即某个样本的标签信息被编码进自身特征。CatBoost 通过随机排列和有序统计降低这种偏差，并通过对称树结构提高推理效率。虽然本文预处理阶段使用了统一独热编码，但 CatBoost 的 Boosting 机制仍表现出很强竞争力。</w:t>
+        <w:t>CatBoost 的优势在于类别特征处理和有序提升。传统目标编码容易引入目标泄露，即某个样本的标签信息被编码进自身特征。CatBoost 通过随机排列和有序统计降低这种偏差，并通过对称树结构提高推理效率。近年基准比较中，CatBoost 常与 XGBoost、LightGBM 一起作为树模型代表[2,7]。虽然本文预处理阶段使用了统一独热编码，但 CatBoost 的 Boosting 机制仍表现出很强竞争力。</w:t>
       </w:r>
     </w:p>
     <w:p>
@@ -1866,7 +1866,7 @@
           <w:rFonts w:ascii="Times New Roman" w:hAnsi="Times New Roman" w:eastAsia="SimSun"/>
           <w:sz w:val="22"/>
         </w:rPr>
-        <w:t>本文代码仓库地址为 https://github.com/Disorder00/Course-work。仓库给出了环境配置、数据下载方式、样例数据、训练脚本、报告生成脚本和实验记录。为了保证可复现性，代码固定随机种子为 2026，使用相同的 5 折划分比较所有模型。</w:t>
+        <w:t>本文代码仓库地址为 https://github.com/Disorder00/Course-work。仓库给出了环境配置、数据下载方式、样例数据、训练脚本和实验记录。为了保证可复现性，代码固定随机种子为 2026，使用相同的 5 折划分比较所有模型。</w:t>
       </w:r>
     </w:p>
     <w:p>
@@ -2461,7 +2461,7 @@
                 <w:b w:val="0"/>
                 <w:sz w:val="19"/>
               </w:rPr>
-              <w:t>scripts/make_report_assets.py</w:t>
+              <w:t>reports/figures</w:t>
             </w:r>
           </w:p>
         </w:tc>
@@ -2482,7 +2482,7 @@
                 <w:b w:val="0"/>
                 <w:sz w:val="19"/>
               </w:rPr>
-              <w:t>生成 EDA 和论文图</w:t>
+              <w:t>保存数据探索和实验分析图</w:t>
             </w:r>
           </w:p>
         </w:tc>
@@ -2547,7 +2547,7 @@
                 <w:b w:val="0"/>
                 <w:sz w:val="19"/>
               </w:rPr>
-              <w:t>scripts/build_report.py</w:t>
+              <w:t>reports</w:t>
             </w:r>
           </w:p>
         </w:tc>
@@ -2568,7 +2568,7 @@
                 <w:b w:val="0"/>
                 <w:sz w:val="19"/>
               </w:rPr>
-              <w:t>生成 Word 报告</w:t>
+              <w:t>保存课程报告和实验记录</w:t>
             </w:r>
           </w:p>
         </w:tc>
@@ -2589,7 +2589,7 @@
                 <w:b w:val="0"/>
                 <w:sz w:val="19"/>
               </w:rPr>
-              <w:t>复现实验文档</w:t>
+              <w:t>归档实验结论</w:t>
             </w:r>
           </w:p>
         </w:tc>
@@ -3268,7 +3268,7 @@
           <w:rFonts w:ascii="Times New Roman" w:hAnsi="Times New Roman" w:eastAsia="SimSun"/>
           <w:sz w:val="22"/>
         </w:rPr>
-        <w:t>由于课程报告强调算法比较和实验分析，本文没有进行大规模自动超参数搜索，而采用较稳定的经验参数。这样做的好处是实验流程清晰、计算成本可控；不足是线上成绩仍有进一步提升空间。</w:t>
+        <w:t>由于课程报告强调算法比较和实验分析，本文没有进行大规模自动超参数搜索，而采用较稳定的经验参数。这样做的好处是实验流程清晰、计算成本可控；不足是线上成绩仍有进一步提升空间。近年研究也指出，表格模型比较需要同时考虑调参预算、数据规模和模型归纳偏置，否则容易得到不公平的算法结论[2,7]。</w:t>
       </w:r>
     </w:p>
     <w:p>
@@ -4292,7 +4292,7 @@
           <w:rFonts w:ascii="Times New Roman" w:hAnsi="Times New Roman" w:eastAsia="SimSun"/>
           <w:sz w:val="22"/>
         </w:rPr>
-        <w:t>从竞赛实践角度看，Public Score 只能反映测试集公开部分的表现，并不能完全代表最终 Private Score。因此报告中更重视本地交叉验证的稳定性。若要进一步提升线上成绩，应避免反复根据 Public Score 调参，以免对公开榜单过拟合。</w:t>
+        <w:t>从竞赛实践角度看，Public Score 只能反映测试集公开部分的表现，并不能完全代表最终 Private Score。因此报告中更重视本地交叉验证的稳定性。若要进一步提升线上成绩，应避免反复根据 Public Score 调参，以免对公开榜单过拟合。类似地，近年表格数据基准研究也强调，模型比较应使用固定验证协议和统一调参预算，不能只依赖单次外部榜单成绩[2,7]。</w:t>
       </w:r>
     </w:p>
     <w:p>
@@ -4386,7 +4386,7 @@
           <w:rFonts w:ascii="Times New Roman" w:hAnsi="Times New Roman" w:eastAsia="SimSun"/>
           <w:sz w:val="22"/>
         </w:rPr>
-        <w:t>按照 SCI 论文常见结构，本文包含问题背景、相关工作、方法、实验设置、数据说明、结果分析、讨论、局限性和参考文献。与正式 SCI 论文相比，本文仍属于课程报告，创新点主要体现在对竞赛问题的工程化复现和扩展算法比较，而不是提出全新算法。</w:t>
+        <w:t>本文按照学术论文的写法组织内容，包括问题背景、相关工作、方法、实验设置、数据说明、结果分析、讨论、局限性和参考文献。与正式 SCI 论文相比，本文仍属于课程报告，创新点主要体现在对竞赛问题的工程化复现和扩展算法比较，而不是提出全新算法。</w:t>
       </w:r>
     </w:p>
     <w:p>
@@ -4399,7 +4399,7 @@
           <w:rFonts w:ascii="Times New Roman" w:hAnsi="Times New Roman" w:eastAsia="SimSun"/>
           <w:sz w:val="22"/>
         </w:rPr>
-        <w:t>为了增强论文式表达，报告中尽量避免只给出“跑分结果”，而是解释指标选择、算法机制、分布特征和误差来源。实验部分同时报告本地交叉验证和 Kaggle 线上成绩，能够体现模型选择与外部评测之间的一致性。</w:t>
+        <w:t>为了增强论文式表达，报告中尽量避免只给出“跑分结果”，而是解释指标选择、算法机制、分布特征和误差来源。实验部分同时报告本地交叉验证和 Kaggle 线上成绩，能够体现模型选择与外部评测之间的一致性。相关讨论也参考了近年表格数据研究中关于树模型、深度模型和调参公平性的结论[2-8]。</w:t>
       </w:r>
     </w:p>
     <w:p>
@@ -4439,7 +4439,7 @@
           <w:rFonts w:ascii="Times New Roman" w:hAnsi="Times New Roman" w:eastAsia="SimSun"/>
           <w:sz w:val="22"/>
         </w:rPr>
-        <w:t>未来工作可从三个方向展开。首先，构建更丰富的特征体系，例如 TotalSF、HouseAge、RemodAge、QualArea、HasPool、HasGarage 等。其次，引入 Optuna 等自动调参工具，对树深、学习率、叶子数、正则化和采样率进行系统搜索。最后，使用分层交叉验证、异常值鲁棒处理和 Stacking 融合，以进一步提高成绩和稳定性。</w:t>
+        <w:t>未来工作可从三个方向展开。首先，构建更丰富的特征体系，例如 TotalSF、HouseAge、RemodAge、QualArea、HasPool、HasGarage 等。其次，引入 Optuna 等自动调参工具，对树深、学习率、叶子数、正则化和采样率进行系统搜索。最后，使用分层交叉验证、异常值鲁棒处理和 Stacking 融合，以进一步提高成绩和稳定性。如果进一步研究深度表格模型，也可以参考 TabPFN、SAINT 和表格预训练目标等近年工作，但需要在统一调参预算下与树模型进行公平比较[6,9-10]。</w:t>
       </w:r>
     </w:p>
     <w:p>
@@ -4505,7 +4505,7 @@
           <w:rFonts w:ascii="Times New Roman" w:hAnsi="Times New Roman" w:eastAsia="SimSun"/>
           <w:sz w:val="20"/>
         </w:rPr>
-        <w:t>[1] Kaggle. House Prices - Advanced Regression Techniques[EB/OL]. https://www.kaggle.com/competitions/house-prices-advanced-regression-techniques.</w:t>
+        <w:t>[1] Kaggle. House Prices - Advanced Regression Techniques[EB/OL]. https://www.kaggle.com/competitions/house-prices-advanced-regression-techniques, accessed 2026-05-27.</w:t>
       </w:r>
     </w:p>
     <w:p>
@@ -4517,7 +4517,7 @@
           <w:rFonts w:ascii="Times New Roman" w:hAnsi="Times New Roman" w:eastAsia="SimSun"/>
           <w:sz w:val="20"/>
         </w:rPr>
-        <w:t>[2] De Cock D. Ames, Iowa: Alternative to the Boston Housing Data as an End of Semester Regression Project[J]. Journal of Statistics Education, 2011, 19(3).</w:t>
+        <w:t>[2] Grinsztajn L, Oyallon E, Varoquaux G. Why do tree-based models still outperform deep learning on typical tabular data?[C]. Advances in Neural Information Processing Systems, 2022.</w:t>
       </w:r>
     </w:p>
     <w:p>
@@ -4529,7 +4529,7 @@
           <w:rFonts w:ascii="Times New Roman" w:hAnsi="Times New Roman" w:eastAsia="SimSun"/>
           <w:sz w:val="20"/>
         </w:rPr>
-        <w:t>[3] Friedman J H. Greedy Function Approximation: A Gradient Boosting Machine[J]. The Annals of Statistics, 2001, 29(5):1189-1232.</w:t>
+        <w:t>[3] Gorishniy Y, Rubachev I, Khrulkov V, Babenko A. Revisiting Deep Learning Models for Tabular Data[C]. Advances in Neural Information Processing Systems, 2021.</w:t>
       </w:r>
     </w:p>
     <w:p>
@@ -4541,7 +4541,7 @@
           <w:rFonts w:ascii="Times New Roman" w:hAnsi="Times New Roman" w:eastAsia="SimSun"/>
           <w:sz w:val="20"/>
         </w:rPr>
-        <w:t>[4] Breiman L. Random Forests[J]. Machine Learning, 2001, 45:5-32.</w:t>
+        <w:t>[4] Borisov V, Leemann T, Seßler K, Haug J, Pawelczyk M, Kasneci G. Deep Neural Networks and Tabular Data: A Survey[J]. IEEE Transactions on Neural Networks and Learning Systems, 2022.</w:t>
       </w:r>
     </w:p>
     <w:p>
@@ -4553,7 +4553,7 @@
           <w:rFonts w:ascii="Times New Roman" w:hAnsi="Times New Roman" w:eastAsia="SimSun"/>
           <w:sz w:val="20"/>
         </w:rPr>
-        <w:t>[5] Hoerl A E, Kennard R W. Ridge Regression: Biased Estimation for Nonorthogonal Problems[J]. Technometrics, 1970, 12(1):55-67.</w:t>
+        <w:t>[5] Shwartz-Ziv R, Armon A. Tabular Data: Deep Learning is Not All You Need[J]. Information Fusion, 2022, 81:84-90.</w:t>
       </w:r>
     </w:p>
     <w:p>
@@ -4565,7 +4565,7 @@
           <w:rFonts w:ascii="Times New Roman" w:hAnsi="Times New Roman" w:eastAsia="SimSun"/>
           <w:sz w:val="20"/>
         </w:rPr>
-        <w:t>[6] Chen T, Guestrin C. XGBoost: A Scalable Tree Boosting System[C]. Proceedings of the 22nd ACM SIGKDD International Conference on Knowledge Discovery and Data Mining, 2016:785-794.</w:t>
+        <w:t>[6] Hollmann N, Müller S, Eggensperger K, Hutter F. TabPFN: A Transformer That Solves Small Tabular Classification Problems in a Second[C]. International Conference on Learning Representations, 2023.</w:t>
       </w:r>
     </w:p>
     <w:p>
@@ -4577,7 +4577,7 @@
           <w:rFonts w:ascii="Times New Roman" w:hAnsi="Times New Roman" w:eastAsia="SimSun"/>
           <w:sz w:val="20"/>
         </w:rPr>
-        <w:t>[7] Ke G, Meng Q, Finley T, et al. LightGBM: A Highly Efficient Gradient Boosting Decision Tree[C]. Advances in Neural Information Processing Systems, 2017.</w:t>
+        <w:t>[7] McElfresh D, Khandagale S, Valverde J, et al. When Do Neural Nets Outperform Boosted Trees on Tabular Data?[C]. Advances in Neural Information Processing Systems, 2023.</w:t>
       </w:r>
     </w:p>
     <w:p>
@@ -4589,7 +4589,7 @@
           <w:rFonts w:ascii="Times New Roman" w:hAnsi="Times New Roman" w:eastAsia="SimSun"/>
           <w:sz w:val="20"/>
         </w:rPr>
-        <w:t>[8] Prokhorenkova L, Gusev G, Vorobev A, Dorogush A V, Gulin A. CatBoost: unbiased boosting with categorical features[C]. Advances in Neural Information Processing Systems, 2018.</w:t>
+        <w:t>[8] Somvanshi S, Das S, Javed S A, Antariksa G, Hossain A. A Survey on Deep Tabular Learning[EB/OL]. arXiv:2410.12034, 2024.</w:t>
       </w:r>
     </w:p>
     <w:p>
@@ -4601,7 +4601,7 @@
           <w:rFonts w:ascii="Times New Roman" w:hAnsi="Times New Roman" w:eastAsia="SimSun"/>
           <w:sz w:val="20"/>
         </w:rPr>
-        <w:t>[9] Dorogush A V, Ershov V, Gulin A. CatBoost: gradient boosting with categorical features support[EB/OL]. arXiv:1810.11363, 2018.</w:t>
+        <w:t>[9] Rubachev I, Alekberov A, Gorishniy Y, Babenko A. Revisiting Pretraining Objectives for Tabular Deep Learning[EB/OL]. arXiv preprint, 2022.</w:t>
       </w:r>
     </w:p>
     <w:p>
@@ -4613,103 +4613,7 @@
           <w:rFonts w:ascii="Times New Roman" w:hAnsi="Times New Roman" w:eastAsia="SimSun"/>
           <w:sz w:val="20"/>
         </w:rPr>
-        <w:t>[10] Grinsztajn L, Oyallon E, Varoquaux G. Why do tree-based models still outperform deep learning on tabular data?[C]. Advances in Neural Information Processing Systems, 2022.</w:t>
-      </w:r>
-    </w:p>
-    <w:p>
-      <w:pPr>
-        <w:spacing w:after="80" w:line="283" w:lineRule="auto"/>
-      </w:pPr>
-      <w:r>
-        <w:rPr>
-          <w:rFonts w:ascii="Times New Roman" w:hAnsi="Times New Roman" w:eastAsia="SimSun"/>
-          <w:sz w:val="20"/>
-        </w:rPr>
-        <w:t>[11] Borisov V, Leemann T, Seßler K, Haug J, Pawelczyk M, Kasneci G. Deep Neural Networks and Tabular Data: A Survey[J]. IEEE Transactions on Neural Networks and Learning Systems, 2022.</w:t>
-      </w:r>
-    </w:p>
-    <w:p>
-      <w:pPr>
-        <w:spacing w:after="80" w:line="283" w:lineRule="auto"/>
-      </w:pPr>
-      <w:r>
-        <w:rPr>
-          <w:rFonts w:ascii="Times New Roman" w:hAnsi="Times New Roman" w:eastAsia="SimSun"/>
-          <w:sz w:val="20"/>
-        </w:rPr>
-        <w:t>[12] Shwartz-Ziv R, Armon A. Tabular Data: Deep Learning is Not All You Need[J]. Information Fusion, 2022, 81:84-90.</w:t>
-      </w:r>
-    </w:p>
-    <w:p>
-      <w:pPr>
-        <w:spacing w:after="80" w:line="283" w:lineRule="auto"/>
-      </w:pPr>
-      <w:r>
-        <w:rPr>
-          <w:rFonts w:ascii="Times New Roman" w:hAnsi="Times New Roman" w:eastAsia="SimSun"/>
-          <w:sz w:val="20"/>
-        </w:rPr>
-        <w:t>[13] Gorishniy Y, Rubachev I, Khrulkov V, Babenko A. Revisiting Deep Learning Models for Tabular Data[C]. Advances in Neural Information Processing Systems, 2021.</w:t>
-      </w:r>
-    </w:p>
-    <w:p>
-      <w:pPr>
-        <w:spacing w:after="80" w:line="283" w:lineRule="auto"/>
-      </w:pPr>
-      <w:r>
-        <w:rPr>
-          <w:rFonts w:ascii="Times New Roman" w:hAnsi="Times New Roman" w:eastAsia="SimSun"/>
-          <w:sz w:val="20"/>
-        </w:rPr>
-        <w:t>[14] Hancock J T, Khoshgoftaar T M. CatBoost for big data: an interdisciplinary review[J]. Journal of Big Data, 2020, 7:94.</w:t>
-      </w:r>
-    </w:p>
-    <w:p>
-      <w:pPr>
-        <w:spacing w:after="80" w:line="283" w:lineRule="auto"/>
-      </w:pPr>
-      <w:r>
-        <w:rPr>
-          <w:rFonts w:ascii="Times New Roman" w:hAnsi="Times New Roman" w:eastAsia="SimSun"/>
-          <w:sz w:val="20"/>
-        </w:rPr>
-        <w:t>[15] Hastie T, Tibshirani R, Friedman J. The Elements of Statistical Learning[M]. Springer, 2009.</w:t>
-      </w:r>
-    </w:p>
-    <w:p>
-      <w:pPr>
-        <w:spacing w:after="80" w:line="283" w:lineRule="auto"/>
-      </w:pPr>
-      <w:r>
-        <w:rPr>
-          <w:rFonts w:ascii="Times New Roman" w:hAnsi="Times New Roman" w:eastAsia="SimSun"/>
-          <w:sz w:val="20"/>
-        </w:rPr>
-        <w:t>[16] Kuhn M, Johnson K. Applied Predictive Modeling[M]. Springer, 2013.</w:t>
-      </w:r>
-    </w:p>
-    <w:p>
-      <w:pPr>
-        <w:spacing w:after="80" w:line="283" w:lineRule="auto"/>
-      </w:pPr>
-      <w:r>
-        <w:rPr>
-          <w:rFonts w:ascii="Times New Roman" w:hAnsi="Times New Roman" w:eastAsia="SimSun"/>
-          <w:sz w:val="20"/>
-        </w:rPr>
-        <w:t>[17] Pedregosa F, Varoquaux G, Gramfort A, et al. Scikit-learn: Machine Learning in Python[J]. Journal of Machine Learning Research, 2011, 12:2825-2830.</w:t>
-      </w:r>
-    </w:p>
-    <w:p>
-      <w:pPr>
-        <w:spacing w:after="80" w:line="283" w:lineRule="auto"/>
-      </w:pPr>
-      <w:r>
-        <w:rPr>
-          <w:rFonts w:ascii="Times New Roman" w:hAnsi="Times New Roman" w:eastAsia="SimSun"/>
-          <w:sz w:val="20"/>
-        </w:rPr>
-        <w:t>[18] Hunter J D. Matplotlib: A 2D Graphics Environment[J]. Computing in Science &amp; Engineering, 2007, 9(3):90-95.</w:t>
+        <w:t>[10] Somepalli G, Goldblum M, Schwarzschild A, Bruss C B, Goldstein T. SAINT: Improved Neural Networks for Tabular Data via Row Attention and Contrastive Pre-Training[EB/OL]. arXiv preprint, 2021.</w:t>
       </w:r>
     </w:p>
     <w:p>
@@ -4775,33 +4679,7 @@
           <w:rFonts w:ascii="Times New Roman" w:hAnsi="Times New Roman" w:eastAsia="SimSun"/>
           <w:sz w:val="22"/>
         </w:rPr>
-        <w:t>4. 生成图表：python scripts/make_report_assets.py。</w:t>
-      </w:r>
-    </w:p>
-    <w:p>
-      <w:pPr>
-        <w:spacing w:after="120" w:line="283" w:lineRule="auto"/>
-        <w:ind w:firstLine="403"/>
-      </w:pPr>
-      <w:r>
-        <w:rPr>
-          <w:rFonts w:ascii="Times New Roman" w:hAnsi="Times New Roman" w:eastAsia="SimSun"/>
-          <w:sz w:val="22"/>
-        </w:rPr>
-        <w:t>5. 生成报告：python scripts/build_report.py。</w:t>
-      </w:r>
-    </w:p>
-    <w:p>
-      <w:pPr>
-        <w:spacing w:after="120" w:line="283" w:lineRule="auto"/>
-        <w:ind w:firstLine="403"/>
-      </w:pPr>
-      <w:r>
-        <w:rPr>
-          <w:rFonts w:ascii="Times New Roman" w:hAnsi="Times New Roman" w:eastAsia="SimSun"/>
-          <w:sz w:val="22"/>
-        </w:rPr>
-        <w:t>6. 代码仓库：https://github.com/Disorder00/Course-work。</w:t>
+        <w:t>4. 代码仓库：https://github.com/Disorder00/Course-work。</w:t>
       </w:r>
     </w:p>
     <w:p>

</xml_diff>